<commit_message>
Variant 2: use the 'rings' art border (radiation signs)
Co-Authored-By: Claude Opus 5.5 <noreply@anthropic.com>
Claude-Session: https://claude.ai/code/session_01NMobVqPmAxNmUbsnyQwyS9
</commit_message>
<xml_diff>
--- a/informatyka/Instrukcia.docx
+++ b/informatyka/Instrukcia.docx
@@ -82,7 +82,7 @@
         <w:t xml:space="preserve"> </w:t>
       </w:r>
       <w:r>
-        <w:t xml:space="preserve">(каталог рамок, див. 2.1).</w:t>
+        <w:t xml:space="preserve">(каталог рамок).</w:t>
       </w:r>
     </w:p>
     <w:p>
@@ -5037,29 +5037,71 @@
         <w:pStyle w:val="FirstParagraph"/>
       </w:pPr>
       <w:r>
-        <w:t xml:space="preserve">У файлі стоїть рамка</w:t>
-      </w:r>
-      <w:r>
-        <w:t xml:space="preserve"> </w:t>
-      </w:r>
-      <w:r>
-        <w:rPr>
-          <w:bCs/>
-          <w:b/>
-        </w:rPr>
-        <w:t xml:space="preserve">«swirligig»</w:t>
-      </w:r>
-      <w:r>
-        <w:t xml:space="preserve"> </w:t>
-      </w:r>
-      <w:r>
-        <w:t xml:space="preserve">(кружечки-вертушки). Якщо у вашому Word вона виглядає не як знак радіації:</w:t>
-      </w:r>
-      <w:r>
-        <w:t xml:space="preserve"> </w:t>
-      </w:r>
-      <w:r>
-        <w:t xml:space="preserve">1. Відкрийте</w:t>
+        <w:rPr>
+          <w:bCs/>
+          <w:b/>
+        </w:rPr>
+        <w:t xml:space="preserve">«Разметка страницы» → «Границы страниц»</w:t>
+      </w:r>
+      <w:r>
+        <w:t xml:space="preserve"> </w:t>
+      </w:r>
+      <w:r>
+        <w:t xml:space="preserve">→ вкладка</w:t>
+      </w:r>
+      <w:r>
+        <w:t xml:space="preserve"> </w:t>
+      </w:r>
+      <w:r>
+        <w:rPr>
+          <w:bCs/>
+          <w:b/>
+        </w:rPr>
+        <w:t xml:space="preserve">«Страница»</w:t>
+      </w:r>
+      <w:r>
+        <w:t xml:space="preserve"> </w:t>
+      </w:r>
+      <w:r>
+        <w:t xml:space="preserve">→ список</w:t>
+      </w:r>
+      <w:r>
+        <w:t xml:space="preserve"> </w:t>
+      </w:r>
+      <w:r>
+        <w:rPr>
+          <w:bCs/>
+          <w:b/>
+        </w:rPr>
+        <w:t xml:space="preserve">«Рисунок:»</w:t>
+      </w:r>
+      <w:r>
+        <w:t xml:space="preserve"> </w:t>
+      </w:r>
+      <w:r>
+        <w:t xml:space="preserve">→</w:t>
+      </w:r>
+      <w:r>
+        <w:t xml:space="preserve"> </w:t>
+      </w:r>
+      <w:r>
+        <w:t xml:space="preserve">прогорнути до</w:t>
+      </w:r>
+      <w:r>
+        <w:t xml:space="preserve"> </w:t>
+      </w:r>
+      <w:r>
+        <w:rPr>
+          <w:bCs/>
+          <w:b/>
+        </w:rPr>
+        <w:t xml:space="preserve">кружечків-знаків радіації</w:t>
+      </w:r>
+      <w:r>
+        <w:t xml:space="preserve"> </w:t>
+      </w:r>
+      <w:r>
+        <w:t xml:space="preserve">(у каталозі</w:t>
       </w:r>
       <w:r>
         <w:t xml:space="preserve"> </w:t>
@@ -5067,82 +5109,33 @@
       <w:r>
         <w:rPr>
           <w:rStyle w:val="VerbatimChar"/>
-          <w:bCs/>
-          <w:b/>
         </w:rPr>
         <w:t xml:space="preserve">Ramky_vybir.docx</w:t>
       </w:r>
       <w:r>
-        <w:t xml:space="preserve">: там</w:t>
-      </w:r>
-      <w:r>
-        <w:t xml:space="preserve"> </w:t>
-      </w:r>
-      <w:r>
-        <w:rPr>
-          <w:bCs/>
-          <w:b/>
-        </w:rPr>
-        <w:t xml:space="preserve">24 сторінки</w:t>
-      </w:r>
-      <w:r>
-        <w:t xml:space="preserve">, на кожній — інша рамка і її номер.</w:t>
-      </w:r>
-      <w:r>
-        <w:t xml:space="preserve"> </w:t>
-      </w:r>
-      <w:r>
-        <w:t xml:space="preserve">2. Знайдіть сторінку, де рамка — кружечки радіації, як на аркуші.</w:t>
-      </w:r>
-      <w:r>
-        <w:t xml:space="preserve"> </w:t>
-      </w:r>
-      <w:r>
-        <w:t xml:space="preserve">3. У</w:t>
-      </w:r>
-      <w:r>
-        <w:t xml:space="preserve"> </w:t>
-      </w:r>
-      <w:r>
-        <w:rPr>
-          <w:rStyle w:val="VerbatimChar"/>
-        </w:rPr>
-        <w:t xml:space="preserve">Variant_2.docx</w:t>
-      </w:r>
-      <w:r>
-        <w:t xml:space="preserve">:</w:t>
-      </w:r>
-      <w:r>
-        <w:t xml:space="preserve"> </w:t>
-      </w:r>
-      <w:r>
-        <w:rPr>
-          <w:bCs/>
-          <w:b/>
-        </w:rPr>
-        <w:t xml:space="preserve">«Разметка страницы» → «Границы страниц» → «Рисунок:»</w:t>
-      </w:r>
-      <w:r>
-        <w:t xml:space="preserve"> </w:t>
-      </w:r>
-      <w:r>
-        <w:t xml:space="preserve">→ у списку оберіть</w:t>
-      </w:r>
-      <w:r>
-        <w:t xml:space="preserve"> </w:t>
-      </w:r>
-      <w:r>
-        <w:rPr>
-          <w:bCs/>
-          <w:b/>
-        </w:rPr>
-        <w:t xml:space="preserve">той самий малюнок</w:t>
-      </w:r>
-      <w:r>
-        <w:t xml:space="preserve"> </w:t>
-      </w:r>
-      <w:r>
-        <w:t xml:space="preserve">(він виглядає так само, як на знайденій сторінці) →</w:t>
+        <w:t xml:space="preserve"> </w:t>
+      </w:r>
+      <w:r>
+        <w:t xml:space="preserve">це сторінка</w:t>
+      </w:r>
+      <w:r>
+        <w:t xml:space="preserve"> </w:t>
+      </w:r>
+      <w:r>
+        <w:rPr>
+          <w:bCs/>
+          <w:b/>
+        </w:rPr>
+        <w:t xml:space="preserve">№ 9</w:t>
+      </w:r>
+      <w:r>
+        <w:t xml:space="preserve">,</w:t>
+      </w:r>
+      <w:r>
+        <w:t xml:space="preserve"> </w:t>
+      </w:r>
+      <w:r>
+        <w:t xml:space="preserve">рамка «rings») →</w:t>
       </w:r>
       <w:r>
         <w:t xml:space="preserve"> </w:t>
@@ -5174,7 +5167,17 @@
         <w:t xml:space="preserve"> </w:t>
       </w:r>
       <w:r>
-        <w:t xml:space="preserve">16 пт →</w:t>
+        <w:rPr>
+          <w:bCs/>
+          <w:b/>
+        </w:rPr>
+        <w:t xml:space="preserve">16 пт</w:t>
+      </w:r>
+      <w:r>
+        <w:t xml:space="preserve"> </w:t>
+      </w:r>
+      <w:r>
+        <w:t xml:space="preserve">→</w:t>
       </w:r>
       <w:r>
         <w:t xml:space="preserve"> </w:t>
@@ -5206,17 +5209,17 @@
         <w:t xml:space="preserve"> </w:t>
       </w:r>
       <w:r>
-        <w:t xml:space="preserve">→ від</w:t>
-      </w:r>
-      <w:r>
-        <w:t xml:space="preserve"> </w:t>
-      </w:r>
-      <w:r>
-        <w:rPr>
-          <w:bCs/>
-          <w:b/>
-        </w:rPr>
-        <w:t xml:space="preserve">края страницы</w:t>
+        <w:t xml:space="preserve">→</w:t>
+      </w:r>
+      <w:r>
+        <w:t xml:space="preserve"> </w:t>
+      </w:r>
+      <w:r>
+        <w:rPr>
+          <w:bCs/>
+          <w:b/>
+        </w:rPr>
+        <w:t xml:space="preserve">«Относительно:» края страницы</w:t>
       </w:r>
       <w:r>
         <w:t xml:space="preserve">,</w:t>
@@ -5225,6 +5228,12 @@
         <w:t xml:space="preserve"> </w:t>
       </w:r>
       <w:r>
+        <w:t xml:space="preserve">усі поля</w:t>
+      </w:r>
+      <w:r>
+        <w:t xml:space="preserve"> </w:t>
+      </w:r>
+      <w:r>
         <w:rPr>
           <w:bCs/>
           <w:b/>
@@ -5236,14 +5245,6 @@
       </w:r>
       <w:r>
         <w:t xml:space="preserve">→ OK.</w:t>
-      </w:r>
-    </w:p>
-    <w:p>
-      <w:pPr>
-        <w:pStyle w:val="BodyText"/>
-      </w:pPr>
-      <w:r>
-        <w:t xml:space="preserve">(Або просто напишіть мені номер сторінки з каталогу — я поставлю цю рамку у файл.)</w:t>
       </w:r>
     </w:p>
     <w:bookmarkEnd w:id="38"/>

</xml_diff>